<commit_message>
Symphony test, nslphom_dual implementation (test)
</commit_message>
<xml_diff>
--- a/MeinMaterial/Besprechungen/Gespräch5.docx
+++ b/MeinMaterial/Besprechungen/Gespräch5.docx
@@ -50,404 +50,555 @@
       </w:r>
     </w:p>
     <w:p>
-      <w:r>
-        <w:t>Nächster Prompt:</w:t>
-      </w:r>
-      <w:r>
-        <w:br/>
-      </w:r>
-      <w:r>
-        <w:t xml:space="preserve">ich habe test2000 </w:t>
-      </w:r>
-      <w:proofErr w:type="spellStart"/>
-      <w:r>
-        <w:t>skript</w:t>
-      </w:r>
-      <w:proofErr w:type="spellEnd"/>
-      <w:r>
-        <w:t xml:space="preserve"> mit 5300 </w:t>
-      </w:r>
-      <w:proofErr w:type="spellStart"/>
-      <w:r>
-        <w:t>einheiten</w:t>
-      </w:r>
-      <w:proofErr w:type="spellEnd"/>
-      <w:r>
-        <w:t xml:space="preserve"> durchlaufen lassen. Das </w:t>
-      </w:r>
-      <w:proofErr w:type="spellStart"/>
-      <w:r>
-        <w:t>ergebnis</w:t>
-      </w:r>
-      <w:proofErr w:type="spellEnd"/>
-      <w:r>
-        <w:t xml:space="preserve"> liegt in dem </w:t>
-      </w:r>
-      <w:proofErr w:type="spellStart"/>
-      <w:r>
-        <w:t>ordner</w:t>
-      </w:r>
-      <w:proofErr w:type="spellEnd"/>
-      <w:r>
-        <w:t xml:space="preserve"> wie es test2000 speichert (nur mit 5300 benannt). gehe soweit davon aus, als wäre das </w:t>
-      </w:r>
-      <w:proofErr w:type="spellStart"/>
-      <w:r>
-        <w:t>gesamtdeutschland</w:t>
-      </w:r>
-      <w:proofErr w:type="spellEnd"/>
-      <w:r>
-        <w:t xml:space="preserve"> gefittet worden und mache die Analyse von </w:t>
-      </w:r>
-      <w:proofErr w:type="spellStart"/>
-      <w:r>
-        <w:t>EHet</w:t>
-      </w:r>
-      <w:proofErr w:type="spellEnd"/>
-      <w:r>
-        <w:t xml:space="preserve">: </w:t>
-      </w:r>
-      <w:proofErr w:type="spellStart"/>
-      <w:r>
-        <w:t>heterogenität</w:t>
-      </w:r>
-      <w:proofErr w:type="spellEnd"/>
-      <w:r>
-        <w:t xml:space="preserve"> und somit verletzte </w:t>
-      </w:r>
-      <w:proofErr w:type="spellStart"/>
-      <w:r>
-        <w:t>homogenität</w:t>
-      </w:r>
-      <w:proofErr w:type="spellEnd"/>
-      <w:r>
-        <w:t xml:space="preserve"> prüfen. dies sollte ausgegeben werden aus dem </w:t>
-      </w:r>
-      <w:proofErr w:type="spellStart"/>
-      <w:r>
-        <w:t>modell</w:t>
-      </w:r>
-      <w:proofErr w:type="spellEnd"/>
-      <w:r>
-        <w:t xml:space="preserve"> in </w:t>
-      </w:r>
-      <w:proofErr w:type="spellStart"/>
-      <w:r>
-        <w:t>form</w:t>
-      </w:r>
-      <w:proofErr w:type="spellEnd"/>
-      <w:r>
-        <w:t xml:space="preserve"> von </w:t>
-      </w:r>
-      <w:proofErr w:type="spellStart"/>
-      <w:r>
-        <w:t>EHet</w:t>
-      </w:r>
-      <w:proofErr w:type="spellEnd"/>
-      <w:r>
-        <w:t xml:space="preserve"> </w:t>
-      </w:r>
-      <w:proofErr w:type="spellStart"/>
-      <w:r>
-        <w:t>matrixen</w:t>
-      </w:r>
-      <w:proofErr w:type="spellEnd"/>
-      <w:r>
-        <w:t xml:space="preserve"> ausgegeben. rechnet man dort die </w:t>
-      </w:r>
-      <w:proofErr w:type="spellStart"/>
-      <w:r>
-        <w:t>summe</w:t>
-      </w:r>
-      <w:proofErr w:type="spellEnd"/>
-      <w:r>
-        <w:t xml:space="preserve"> über alle </w:t>
-      </w:r>
-      <w:proofErr w:type="spellStart"/>
-      <w:r>
-        <w:t>einträge</w:t>
-      </w:r>
-      <w:proofErr w:type="spellEnd"/>
-      <w:r>
-        <w:t xml:space="preserve"> müsste man ja die </w:t>
-      </w:r>
-      <w:proofErr w:type="spellStart"/>
-      <w:r>
-        <w:t>differenz</w:t>
-      </w:r>
-      <w:proofErr w:type="spellEnd"/>
-      <w:r>
-        <w:t xml:space="preserve"> zu </w:t>
-      </w:r>
-      <w:proofErr w:type="spellStart"/>
-      <w:r>
-        <w:t>ergebissen</w:t>
-      </w:r>
-      <w:proofErr w:type="spellEnd"/>
-      <w:r>
-        <w:t xml:space="preserve"> unter </w:t>
-      </w:r>
-      <w:proofErr w:type="spellStart"/>
-      <w:r>
-        <w:t>homogenität</w:t>
-      </w:r>
-      <w:proofErr w:type="spellEnd"/>
-      <w:r>
-        <w:t xml:space="preserve"> bekommen richtig? es sind </w:t>
-      </w:r>
-      <w:proofErr w:type="spellStart"/>
-      <w:r>
-        <w:t>absolutzahlen</w:t>
-      </w:r>
-      <w:proofErr w:type="spellEnd"/>
-      <w:r>
-        <w:t xml:space="preserve"> an </w:t>
-      </w:r>
-      <w:proofErr w:type="spellStart"/>
-      <w:r>
-        <w:t>abweichungen</w:t>
-      </w:r>
-      <w:proofErr w:type="spellEnd"/>
-      <w:r>
-        <w:t xml:space="preserve"> und ich möchte, dass diese dann relativiert werden durch ihre eigene </w:t>
-      </w:r>
-      <w:proofErr w:type="spellStart"/>
-      <w:r>
-        <w:t>Wahlberechtigtengröße</w:t>
-      </w:r>
-      <w:proofErr w:type="spellEnd"/>
-      <w:r>
-        <w:t xml:space="preserve">. man kriegt ja </w:t>
-      </w:r>
-      <w:proofErr w:type="spellStart"/>
-      <w:r>
-        <w:t>EHet</w:t>
-      </w:r>
-      <w:proofErr w:type="spellEnd"/>
-      <w:r>
-        <w:t xml:space="preserve"> pro lokaler </w:t>
-      </w:r>
-      <w:proofErr w:type="spellStart"/>
-      <w:r>
-        <w:t>EInheit</w:t>
-      </w:r>
-      <w:proofErr w:type="spellEnd"/>
-      <w:r>
-        <w:t xml:space="preserve"> oder? Dann wäre mein Ziel diese Ergebnisse zu plotten um Ausreißer zu identifizieren und bestenfalls auf eine Deutschlandkarte zu plotten, damit man visuell sieht, ob bspw. eher kleinere oder abgelegener Gemeinden betroffen sind etc.</w:t>
+      <w:pPr>
+        <w:rPr>
+          <w:lang w:val="en-US"/>
+        </w:rPr>
+      </w:pPr>
+      <w:r>
+        <w:rPr>
+          <w:b/>
+          <w:bCs/>
+          <w:lang w:val="en-US"/>
+        </w:rPr>
+        <w:t xml:space="preserve">Neue </w:t>
+      </w:r>
+      <w:proofErr w:type="spellStart"/>
+      <w:r>
+        <w:rPr>
+          <w:b/>
+          <w:bCs/>
+          <w:lang w:val="en-US"/>
+        </w:rPr>
+        <w:t>Literatur</w:t>
+      </w:r>
+      <w:proofErr w:type="spellEnd"/>
+      <w:r>
+        <w:rPr>
+          <w:lang w:val="en-US"/>
+        </w:rPr>
+        <w:br/>
+        <w:t>Estimation of voter tr</w:t>
+      </w:r>
+      <w:r>
+        <w:rPr>
+          <w:lang w:val="en-US"/>
+        </w:rPr>
+        <w:t>ansitions and the ecological fallacy</w:t>
+      </w:r>
+      <w:r>
+        <w:rPr>
+          <w:lang w:val="en-US"/>
+        </w:rPr>
+        <w:br/>
+      </w:r>
+      <w:r>
+        <w:rPr>
+          <w:lang w:val="en-US"/>
+        </w:rPr>
+        <w:t>"</w:t>
+      </w:r>
+      <w:proofErr w:type="spellStart"/>
+      <w:r>
+        <w:rPr>
+          <w:lang w:val="en-US"/>
+        </w:rPr>
+        <w:t>Zusammenfassung</w:t>
+      </w:r>
+      <w:proofErr w:type="spellEnd"/>
+      <w:r>
+        <w:rPr>
+          <w:lang w:val="en-US"/>
+        </w:rPr>
+        <w:t>" von EI</w:t>
       </w:r>
     </w:p>
     <w:p>
-      <w:r>
-        <w:t xml:space="preserve">wie besprochen dann für </w:t>
-      </w:r>
-      <w:proofErr w:type="spellStart"/>
-      <w:r>
-        <w:t>einträge</w:t>
-      </w:r>
-      <w:proofErr w:type="spellEnd"/>
-      <w:r>
-        <w:t xml:space="preserve"> i </w:t>
-      </w:r>
+      <w:pPr>
+        <w:rPr>
+          <w:lang w:val="en-US"/>
+        </w:rPr>
+      </w:pPr>
     </w:p>
     <w:p>
       <w:r>
-        <w:t xml:space="preserve">0.5 * </w:t>
-      </w:r>
-      <w:proofErr w:type="spellStart"/>
-      <w:r>
-        <w:t>sum</w:t>
-      </w:r>
-      <w:proofErr w:type="spellEnd"/>
-      <w:r>
-        <w:t>(</w:t>
-      </w:r>
-      <w:proofErr w:type="spellStart"/>
-      <w:r>
-        <w:t>abs</w:t>
-      </w:r>
-      <w:proofErr w:type="spellEnd"/>
-      <w:r>
-        <w:t>(</w:t>
-      </w:r>
-      <w:proofErr w:type="spellStart"/>
-      <w:r>
-        <w:t>EHet_i</w:t>
-      </w:r>
-      <w:proofErr w:type="spellEnd"/>
-      <w:r>
-        <w:t xml:space="preserve">, )) / </w:t>
-      </w:r>
-      <w:proofErr w:type="spellStart"/>
-      <w:r>
-        <w:t>Wahlberechtigte_i</w:t>
-      </w:r>
-      <w:proofErr w:type="spellEnd"/>
+        <w:rPr>
+          <w:b/>
+          <w:bCs/>
+        </w:rPr>
+        <w:t>Literaturrecherche KI</w:t>
+      </w:r>
+      <w:r>
+        <w:t xml:space="preserve">: </w:t>
+      </w:r>
+      <w:proofErr w:type="spellStart"/>
+      <w:r>
+        <w:t>Ellicit</w:t>
+      </w:r>
+      <w:proofErr w:type="spellEnd"/>
+      <w:r>
+        <w:br/>
+        <w:t>Literaturrecherche v</w:t>
+      </w:r>
+      <w:r>
+        <w:t>oranbringen</w:t>
+      </w:r>
+    </w:p>
+    <w:p/>
+    <w:p>
+      <w:r>
+        <w:rPr>
+          <w:b/>
+          <w:bCs/>
+        </w:rPr>
+        <w:t>Regression</w:t>
+      </w:r>
+      <w:r>
+        <w:br/>
+      </w:r>
+      <w:r>
+        <w:t>Wichtig: alle Variablen Normalisieren!</w:t>
+      </w:r>
+      <w:r>
+        <w:br/>
+      </w:r>
+      <w:r>
+        <w:t>Differenz und Standwerte kombinierbar</w:t>
+      </w:r>
     </w:p>
     <w:p>
-      <w:r>
-        <w:t xml:space="preserve">dann kommt für jede </w:t>
-      </w:r>
-      <w:proofErr w:type="spellStart"/>
-      <w:r>
-        <w:t>einheit</w:t>
-      </w:r>
-      <w:proofErr w:type="spellEnd"/>
-      <w:r>
-        <w:t xml:space="preserve"> ein Wert raus. mit diesen Werten machen wir dann unsere Grafik:</w:t>
+      <w:proofErr w:type="spellStart"/>
+      <w:r>
+        <w:t>Multinomialmodell</w:t>
+      </w:r>
+      <w:proofErr w:type="spellEnd"/>
+      <w:r>
+        <w:t>, Standardisierung auf Summe muss 1 sein</w:t>
       </w:r>
     </w:p>
     <w:p>
-      <w:proofErr w:type="spellStart"/>
-      <w:r>
-        <w:t>agg.schlüssel</w:t>
-      </w:r>
-      <w:proofErr w:type="spellEnd"/>
-      <w:r>
-        <w:t xml:space="preserve"> in einzelne Gemeindeschlüssel splitten.</w:t>
-      </w:r>
+      <w:r>
+        <w:t xml:space="preserve">Keine Kausalität, viel </w:t>
+      </w:r>
+      <w:proofErr w:type="spellStart"/>
+      <w:r>
+        <w:t>Confounding</w:t>
+      </w:r>
+      <w:proofErr w:type="spellEnd"/>
     </w:p>
     <w:p>
       <w:r>
-        <w:t xml:space="preserve">Gemeindeschlüssel an Geometrien </w:t>
-      </w:r>
-      <w:proofErr w:type="spellStart"/>
-      <w:r>
-        <w:t>joinen</w:t>
-      </w:r>
-      <w:proofErr w:type="spellEnd"/>
-      <w:r>
-        <w:t>.</w:t>
+        <w:t xml:space="preserve">Mit </w:t>
+      </w:r>
+      <w:proofErr w:type="spellStart"/>
+      <w:r>
+        <w:t>chatgpt</w:t>
+      </w:r>
+      <w:proofErr w:type="spellEnd"/>
+      <w:r>
+        <w:t xml:space="preserve"> über </w:t>
+      </w:r>
+      <w:proofErr w:type="spellStart"/>
+      <w:r>
+        <w:t>Confounding</w:t>
+      </w:r>
+      <w:proofErr w:type="spellEnd"/>
+      <w:r>
+        <w:t xml:space="preserve"> Potenzial bei erwählten Variablen sprechen</w:t>
+      </w:r>
+      <w:r>
+        <w:br/>
+        <w:t>Überlegen: möglichst viele oder nur einzelne Variablen?</w:t>
+      </w:r>
+    </w:p>
+    <w:p/>
+    <w:p>
+      <w:proofErr w:type="spellStart"/>
+      <w:r>
+        <w:rPr>
+          <w:b/>
+          <w:bCs/>
+        </w:rPr>
+        <w:t>Nslphom</w:t>
+      </w:r>
+      <w:proofErr w:type="spellEnd"/>
+      <w:r>
+        <w:br/>
+      </w:r>
+      <w:proofErr w:type="spellStart"/>
+      <w:r>
+        <w:t>entries</w:t>
+      </w:r>
+      <w:proofErr w:type="spellEnd"/>
+      <w:r>
+        <w:t xml:space="preserve"> und </w:t>
+      </w:r>
+      <w:proofErr w:type="spellStart"/>
+      <w:r>
+        <w:t>exits</w:t>
+      </w:r>
+      <w:proofErr w:type="spellEnd"/>
+      <w:r>
+        <w:t xml:space="preserve"> entfernen aus Schätzung: ein Wahlergebnis auf </w:t>
+      </w:r>
+      <w:proofErr w:type="spellStart"/>
+      <w:r>
+        <w:t>anzahl</w:t>
+      </w:r>
+      <w:proofErr w:type="spellEnd"/>
+      <w:r>
+        <w:t xml:space="preserve"> </w:t>
+      </w:r>
+      <w:proofErr w:type="spellStart"/>
+      <w:r>
+        <w:t>wähler</w:t>
+      </w:r>
+      <w:proofErr w:type="spellEnd"/>
+      <w:r>
+        <w:t xml:space="preserve"> der anderen Wahl standardisieren</w:t>
       </w:r>
     </w:p>
     <w:p>
-      <w:r>
-        <w:t xml:space="preserve">Alle Gemeinden innerhalb eines </w:t>
-      </w:r>
-      <w:proofErr w:type="spellStart"/>
-      <w:r>
-        <w:t>agg.schlüssel</w:t>
-      </w:r>
-      <w:proofErr w:type="spellEnd"/>
-      <w:r>
-        <w:t xml:space="preserve"> mit sf::</w:t>
-      </w:r>
-      <w:proofErr w:type="spellStart"/>
-      <w:r>
-        <w:t>st_union</w:t>
-      </w:r>
-      <w:proofErr w:type="spellEnd"/>
-      <w:r>
-        <w:t>() zusammenfassen.</w:t>
+      <w:proofErr w:type="spellStart"/>
+      <w:r>
+        <w:t>Nslphom_dual</w:t>
+      </w:r>
+      <w:proofErr w:type="spellEnd"/>
+      <w:r>
+        <w:t xml:space="preserve"> aus mathematischer Sicht und gezeigt, dass es besser performt (schätzt in beide </w:t>
+      </w:r>
+      <w:proofErr w:type="spellStart"/>
+      <w:r>
+        <w:t>richtungen</w:t>
+      </w:r>
+      <w:proofErr w:type="spellEnd"/>
+      <w:r>
+        <w:t>)</w:t>
       </w:r>
     </w:p>
     <w:p>
-      <w:r>
-        <w:t xml:space="preserve">Heterogenitätswert an diese Geometrie </w:t>
-      </w:r>
-      <w:proofErr w:type="spellStart"/>
-      <w:r>
-        <w:t>joinen</w:t>
-      </w:r>
-      <w:proofErr w:type="spellEnd"/>
-      <w:r>
-        <w:t>.</w:t>
+      <w:proofErr w:type="spellStart"/>
+      <w:r>
+        <w:t>Iter_max</w:t>
+      </w:r>
+      <w:proofErr w:type="spellEnd"/>
+      <w:r>
+        <w:t xml:space="preserve">: ist 10 wirklich optimal? (siehe neues Material) kann mit höheren </w:t>
+      </w:r>
+      <w:proofErr w:type="spellStart"/>
+      <w:r>
+        <w:t>iter_max</w:t>
+      </w:r>
+      <w:proofErr w:type="spellEnd"/>
+      <w:r>
+        <w:t xml:space="preserve"> überprüfen wie sich (Heterogenität </w:t>
+      </w:r>
+      <w:proofErr w:type="spellStart"/>
+      <w:r>
+        <w:t>EHet</w:t>
+      </w:r>
+      <w:proofErr w:type="spellEnd"/>
+      <w:r>
+        <w:t>??) verhält</w:t>
+      </w:r>
+      <w:r>
+        <w:br/>
+      </w:r>
+      <w:r>
+        <w:br/>
+      </w:r>
+      <w:r>
+        <w:rPr>
+          <w:b/>
+          <w:bCs/>
+        </w:rPr>
+        <w:t>Fall Blockschätzung</w:t>
+      </w:r>
+      <w:r>
+        <w:br/>
+        <w:t xml:space="preserve">+ </w:t>
+      </w:r>
+      <w:proofErr w:type="spellStart"/>
+      <w:r>
+        <w:t>factor</w:t>
+      </w:r>
+      <w:proofErr w:type="spellEnd"/>
+      <w:r>
+        <w:t>(</w:t>
+      </w:r>
+      <w:proofErr w:type="spellStart"/>
+      <w:r>
+        <w:t>nslphom_block</w:t>
+      </w:r>
+      <w:proofErr w:type="spellEnd"/>
+      <w:r>
+        <w:t>): einmal ohne: zeigen sich nur Bundeslandunterschiede, die durch hinzunehmen des Terms verschwinden ist das Regressionsproblem mit Blockschätzung gelöst</w:t>
+      </w:r>
+      <w:r>
+        <w:br/>
+      </w:r>
+      <w:r>
+        <w:br/>
+      </w:r>
+      <w:r>
+        <w:rPr>
+          <w:b/>
+          <w:bCs/>
+        </w:rPr>
+        <w:t xml:space="preserve">Validierung der </w:t>
+      </w:r>
+      <w:proofErr w:type="spellStart"/>
+      <w:r>
+        <w:rPr>
+          <w:b/>
+          <w:bCs/>
+        </w:rPr>
+        <w:t>nslphom</w:t>
+      </w:r>
+      <w:proofErr w:type="spellEnd"/>
+      <w:r>
+        <w:rPr>
+          <w:b/>
+          <w:bCs/>
+        </w:rPr>
+        <w:t xml:space="preserve"> Ergebnisse</w:t>
+      </w:r>
+      <w:r>
+        <w:br/>
+        <w:t>Haben Abweichungen von der Homogenitätsannahme (</w:t>
+      </w:r>
+      <w:proofErr w:type="spellStart"/>
+      <w:r>
+        <w:t>EHet</w:t>
+      </w:r>
+      <w:proofErr w:type="spellEnd"/>
+      <w:r>
+        <w:t xml:space="preserve"> in Modelloutput) eine Struktur?</w:t>
+      </w:r>
+      <w:r>
+        <w:t xml:space="preserve"> </w:t>
+      </w:r>
+      <w:proofErr w:type="spellStart"/>
+      <w:r>
+        <w:t>Z.b.</w:t>
+      </w:r>
+      <w:proofErr w:type="spellEnd"/>
+      <w:r>
+        <w:t xml:space="preserve"> kleinere Wahlaggregationen mit höherer Distanz. Dafür plotten. Quasi Prozentsatz der falsch </w:t>
+      </w:r>
+      <w:proofErr w:type="spellStart"/>
+      <w:r>
+        <w:t>predicteten</w:t>
+      </w:r>
+      <w:proofErr w:type="spellEnd"/>
+      <w:r>
+        <w:t xml:space="preserve"> Bevölkerung: Absolute Zahlen müssen noch mit dem passenden </w:t>
+      </w:r>
+      <w:proofErr w:type="spellStart"/>
+      <w:proofErr w:type="gramStart"/>
+      <w:r>
+        <w:t>agg.schlüssel</w:t>
+      </w:r>
+      <w:proofErr w:type="spellEnd"/>
+      <w:proofErr w:type="gramEnd"/>
+      <w:r>
+        <w:t xml:space="preserve"> Wahlberechtigte geteilt werden</w:t>
+      </w:r>
+      <w:r>
+        <w:br/>
+      </w:r>
+      <w:r>
+        <w:br/>
+      </w:r>
+      <w:r>
+        <w:rPr>
+          <w:b/>
+          <w:bCs/>
+        </w:rPr>
+        <w:t>Signifikanz</w:t>
+      </w:r>
+      <w:r>
+        <w:br/>
+        <w:t xml:space="preserve">p-Werte nicht interpretieren und keine Modellselektion darauf. Sie berechnen sich aus den Unsicherheiten der Regression, beziehen jedoch nicht die Unsicherheiten der </w:t>
+      </w:r>
+      <w:proofErr w:type="spellStart"/>
+      <w:r>
+        <w:t>nslphom</w:t>
+      </w:r>
+      <w:proofErr w:type="spellEnd"/>
+      <w:r>
+        <w:t xml:space="preserve"> Schätzung mit ein</w:t>
       </w:r>
     </w:p>
     <w:p>
       <w:r>
-        <w:t xml:space="preserve">Mit ggplot2 + </w:t>
-      </w:r>
-      <w:proofErr w:type="spellStart"/>
-      <w:r>
-        <w:t>geom_sf</w:t>
-      </w:r>
-      <w:proofErr w:type="spellEnd"/>
-      <w:r>
-        <w:t>() einfärben.</w:t>
+        <w:lastRenderedPageBreak/>
+        <w:t xml:space="preserve">Lösung: Bootstrappen: </w:t>
+      </w:r>
+      <w:proofErr w:type="spellStart"/>
+      <w:proofErr w:type="gramStart"/>
+      <w:r>
+        <w:t>agg.schlüssel</w:t>
+      </w:r>
+      <w:proofErr w:type="spellEnd"/>
+      <w:proofErr w:type="gramEnd"/>
+      <w:r>
+        <w:t xml:space="preserve"> samplen nach Bootstrap Prinzip </w:t>
+      </w:r>
+      <w:r>
+        <w:br/>
+      </w:r>
+      <w:r>
+        <w:t xml:space="preserve">(aus </w:t>
+      </w:r>
+      <w:proofErr w:type="spellStart"/>
+      <w:r>
+        <w:t>computational</w:t>
+      </w:r>
+      <w:proofErr w:type="spellEnd"/>
+      <w:r>
+        <w:t xml:space="preserve"> gründen auf 2000</w:t>
+      </w:r>
+      <w:r>
+        <w:t xml:space="preserve"> (</w:t>
+      </w:r>
+      <w:r>
+        <w:t>1min30</w:t>
+      </w:r>
+      <w:r>
+        <w:t xml:space="preserve">), </w:t>
+      </w:r>
+      <w:r>
+        <w:t xml:space="preserve">4000(4min20), </w:t>
+      </w:r>
+      <w:r>
+        <w:t>5</w:t>
+      </w:r>
+      <w:r>
+        <w:t xml:space="preserve">000 (6min </w:t>
+      </w:r>
+      <w:r>
+        <w:t>1</w:t>
+      </w:r>
+      <w:r>
+        <w:t>0)</w:t>
+      </w:r>
+      <w:r>
+        <w:t xml:space="preserve"> bis maximal </w:t>
+      </w:r>
+      <w:r>
+        <w:t>53</w:t>
+      </w:r>
+      <w:r>
+        <w:t>00</w:t>
+      </w:r>
+      <w:r>
+        <w:t>(&lt;7 min)</w:t>
+      </w:r>
+      <w:r>
+        <w:t xml:space="preserve"> begrenzt)</w:t>
+      </w:r>
+      <w:r>
+        <w:br/>
+        <w:t xml:space="preserve">(Zeiten </w:t>
+      </w:r>
+      <w:proofErr w:type="spellStart"/>
+      <w:r>
+        <w:t>nslphom_dual</w:t>
+      </w:r>
+      <w:proofErr w:type="spellEnd"/>
+      <w:r>
+        <w:t>: 10 min</w:t>
+      </w:r>
+      <w:r>
+        <w:t xml:space="preserve"> für </w:t>
+      </w:r>
+      <w:r>
+        <w:t>4500 Aggregationseinheiten</w:t>
+      </w:r>
+      <w:r>
+        <w:t>,</w:t>
+      </w:r>
+      <w:r>
+        <w:t xml:space="preserve"> 13 min für 5000 Aggregationen)</w:t>
+      </w:r>
+      <w:r>
+        <w:br/>
+        <w:t xml:space="preserve">(Zeiten </w:t>
+      </w:r>
+      <w:proofErr w:type="spellStart"/>
+      <w:r>
+        <w:t>nslphom_dual</w:t>
+      </w:r>
+      <w:proofErr w:type="spellEnd"/>
+      <w:r>
+        <w:t xml:space="preserve"> mit Symphony </w:t>
+      </w:r>
+      <w:proofErr w:type="spellStart"/>
+      <w:r>
+        <w:t>schätzer</w:t>
+      </w:r>
+      <w:proofErr w:type="spellEnd"/>
+      <w:r>
+        <w:t>: 12 min für alle 5965 Aggregationen)</w:t>
       </w:r>
     </w:p>
     <w:p>
       <w:r>
-        <w:t xml:space="preserve">dabei liegt die </w:t>
-      </w:r>
-      <w:proofErr w:type="spellStart"/>
-      <w:r>
-        <w:t>gemeindeflächendatei</w:t>
-      </w:r>
-      <w:proofErr w:type="spellEnd"/>
-      <w:r>
-        <w:t xml:space="preserve"> unter </w:t>
+        <w:t xml:space="preserve"> -&gt; </w:t>
+      </w:r>
+      <w:proofErr w:type="spellStart"/>
+      <w:r>
+        <w:t>nslphom</w:t>
+      </w:r>
+      <w:proofErr w:type="spellEnd"/>
+      <w:r>
+        <w:t xml:space="preserve"> -&gt; Regression -&gt; Ergebnis: Verteilung an geschätzten Betas (wenn 0 im KI enthalten, dann nicht signifikant)</w:t>
+      </w:r>
+      <w:r>
+        <w:br/>
+        <w:t>B = 500, 500 Bootstraps</w:t>
+      </w:r>
+      <w:r>
+        <w:br/>
+        <w:t>kein parametrischer Bootstrap</w:t>
+      </w:r>
+      <w:r>
+        <w:br/>
+        <w:t xml:space="preserve">Bootstrapping später über Server </w:t>
+      </w:r>
+      <w:proofErr w:type="spellStart"/>
+      <w:r>
+        <w:t>parallelisierbar</w:t>
+      </w:r>
+      <w:proofErr w:type="spellEnd"/>
+    </w:p>
+    <w:p>
+      <w:r>
+        <w:t>Mit ChatGPT über Alternativen für Quantifizierung der Unsicherheiten sprechen</w:t>
       </w:r>
     </w:p>
     <w:p/>
     <w:p>
       <w:pPr>
         <w:rPr>
-          <w:lang w:val="en-US"/>
+          <w:b/>
+          <w:bCs/>
         </w:rPr>
       </w:pPr>
       <w:r>
         <w:rPr>
           <w:b/>
           <w:bCs/>
-          <w:lang w:val="en-US"/>
-        </w:rPr>
-        <w:t xml:space="preserve">Neue </w:t>
-      </w:r>
-      <w:proofErr w:type="spellStart"/>
-      <w:r>
-        <w:rPr>
-          <w:b/>
-          <w:bCs/>
-          <w:lang w:val="en-US"/>
-        </w:rPr>
-        <w:t>Literatur</w:t>
-      </w:r>
-      <w:proofErr w:type="spellEnd"/>
-      <w:r>
-        <w:rPr>
-          <w:lang w:val="en-US"/>
-        </w:rPr>
-        <w:br/>
-        <w:t>Estimation of voter tr</w:t>
-      </w:r>
-      <w:r>
-        <w:rPr>
-          <w:lang w:val="en-US"/>
-        </w:rPr>
-        <w:t>ansitions and the ecological fallacy</w:t>
-      </w:r>
-      <w:r>
-        <w:rPr>
-          <w:lang w:val="en-US"/>
-        </w:rPr>
-        <w:br/>
-      </w:r>
-      <w:r>
-        <w:rPr>
-          <w:lang w:val="en-US"/>
-        </w:rPr>
-        <w:t>"</w:t>
-      </w:r>
-      <w:proofErr w:type="spellStart"/>
-      <w:r>
-        <w:rPr>
-          <w:lang w:val="en-US"/>
-        </w:rPr>
-        <w:t>Zusammenfassung</w:t>
-      </w:r>
-      <w:proofErr w:type="spellEnd"/>
-      <w:r>
-        <w:rPr>
-          <w:lang w:val="en-US"/>
-        </w:rPr>
-        <w:t>" von EI</w:t>
+        </w:rPr>
+        <w:t>Union zusammenfassen</w:t>
       </w:r>
     </w:p>
     <w:p>
       <w:pPr>
         <w:rPr>
-          <w:lang w:val="en-US"/>
+          <w:b/>
+          <w:bCs/>
         </w:rPr>
       </w:pPr>
     </w:p>
@@ -457,399 +608,80 @@
           <w:b/>
           <w:bCs/>
         </w:rPr>
-        <w:t>Literaturrecherche KI</w:t>
-      </w:r>
-      <w:r>
-        <w:t xml:space="preserve">: </w:t>
-      </w:r>
-      <w:proofErr w:type="spellStart"/>
-      <w:r>
-        <w:t>Ellicit</w:t>
-      </w:r>
-      <w:proofErr w:type="spellEnd"/>
-      <w:r>
-        <w:br/>
-        <w:t>Literaturrecherche v</w:t>
-      </w:r>
-      <w:r>
-        <w:t>oranbringen</w:t>
-      </w:r>
+        <w:t>Diskussion (wichtigster Teil der Bachelorarbeit)</w:t>
+      </w:r>
+      <w:r>
+        <w:rPr>
+          <w:b/>
+          <w:bCs/>
+        </w:rPr>
+        <w:br/>
+      </w:r>
+      <w:r>
+        <w:t>Problem der sich aggregierenden Fehler</w:t>
+      </w:r>
+      <w:r>
+        <w:br/>
+        <w:t xml:space="preserve">Warum eigener Ansatz invalide </w:t>
+      </w:r>
+      <w:proofErr w:type="gramStart"/>
+      <w:r>
+        <w:t>sein könnte</w:t>
+      </w:r>
+      <w:proofErr w:type="gramEnd"/>
+      <w:r>
+        <w:br/>
+        <w:t>Nachteile eigener Methode</w:t>
+      </w:r>
+      <w:r>
+        <w:br/>
+        <w:t xml:space="preserve">Nachteile anderer Methoden, warum diese nicht genommen wurden, obwohl Literatur </w:t>
+      </w:r>
+      <w:proofErr w:type="gramStart"/>
+      <w:r>
+        <w:t>dagegen spricht</w:t>
+      </w:r>
+      <w:proofErr w:type="gramEnd"/>
     </w:p>
     <w:p/>
+    <w:p/>
     <w:p>
       <w:r>
         <w:rPr>
           <w:b/>
           <w:bCs/>
         </w:rPr>
-        <w:t>Regression</w:t>
-      </w:r>
-      <w:r>
-        <w:br/>
-      </w:r>
-      <w:r>
-        <w:t>Wichtig: alle Variablen Normalisieren!</w:t>
-      </w:r>
-      <w:r>
-        <w:br/>
-      </w:r>
-      <w:r>
-        <w:t>Differenz und Standwerte kombinierbar</w:t>
-      </w:r>
-    </w:p>
-    <w:p>
-      <w:proofErr w:type="spellStart"/>
-      <w:r>
-        <w:t>Multinomialmodell</w:t>
-      </w:r>
-      <w:proofErr w:type="spellEnd"/>
-      <w:r>
-        <w:t>, Standardisierung auf Summe muss 1 sein</w:t>
-      </w:r>
-    </w:p>
-    <w:p>
-      <w:r>
-        <w:t xml:space="preserve">Keine Kausalität, viel </w:t>
-      </w:r>
-      <w:proofErr w:type="spellStart"/>
-      <w:r>
-        <w:t>Confounding</w:t>
-      </w:r>
-      <w:proofErr w:type="spellEnd"/>
-    </w:p>
-    <w:p>
-      <w:r>
-        <w:lastRenderedPageBreak/>
-        <w:t xml:space="preserve">Mit </w:t>
-      </w:r>
-      <w:proofErr w:type="spellStart"/>
-      <w:r>
-        <w:t>chatgpt</w:t>
-      </w:r>
-      <w:proofErr w:type="spellEnd"/>
-      <w:r>
-        <w:t xml:space="preserve"> über </w:t>
-      </w:r>
-      <w:proofErr w:type="spellStart"/>
-      <w:r>
-        <w:t>Confounding</w:t>
-      </w:r>
-      <w:proofErr w:type="spellEnd"/>
-      <w:r>
-        <w:t xml:space="preserve"> Potenzial bei erwählten Variablen sprechen</w:t>
-      </w:r>
-      <w:r>
-        <w:br/>
-        <w:t>Überlegen: möglichst viele oder nur einzelne Variablen?</w:t>
+        <w:t>Problem (einschl. Gemeinden)</w:t>
+      </w:r>
+      <w:r>
+        <w:br/>
+        <w:t>eigenes Mapping?</w:t>
+      </w:r>
+      <w:r>
+        <w:br/>
+        <w:t xml:space="preserve">in </w:t>
+      </w:r>
+      <w:proofErr w:type="spellStart"/>
+      <w:r>
+        <w:t>Strukturdatenmapping</w:t>
+      </w:r>
+      <w:proofErr w:type="spellEnd"/>
+      <w:r>
+        <w:t xml:space="preserve"> aufnehmen!</w:t>
+      </w:r>
+      <w:r>
+        <w:br/>
+      </w:r>
+      <w:proofErr w:type="gramStart"/>
+      <w:r>
+        <w:t>Aufgefallen</w:t>
+      </w:r>
+      <w:proofErr w:type="gramEnd"/>
+      <w:r>
+        <w:t xml:space="preserve"> durch: graue Stellen in deutschlandkarte</w:t>
       </w:r>
     </w:p>
     <w:p/>
-    <w:p>
-      <w:proofErr w:type="spellStart"/>
-      <w:r>
-        <w:rPr>
-          <w:b/>
-          <w:bCs/>
-        </w:rPr>
-        <w:t>Nslphom</w:t>
-      </w:r>
-      <w:proofErr w:type="spellEnd"/>
-      <w:r>
-        <w:br/>
-      </w:r>
-      <w:proofErr w:type="spellStart"/>
-      <w:r>
-        <w:t>entries</w:t>
-      </w:r>
-      <w:proofErr w:type="spellEnd"/>
-      <w:r>
-        <w:t xml:space="preserve"> und </w:t>
-      </w:r>
-      <w:proofErr w:type="spellStart"/>
-      <w:r>
-        <w:t>exits</w:t>
-      </w:r>
-      <w:proofErr w:type="spellEnd"/>
-      <w:r>
-        <w:t xml:space="preserve"> entfernen aus Schätzung: ein Wahlergebnis auf </w:t>
-      </w:r>
-      <w:proofErr w:type="spellStart"/>
-      <w:r>
-        <w:t>anzahl</w:t>
-      </w:r>
-      <w:proofErr w:type="spellEnd"/>
-      <w:r>
-        <w:t xml:space="preserve"> </w:t>
-      </w:r>
-      <w:proofErr w:type="spellStart"/>
-      <w:r>
-        <w:t>wähler</w:t>
-      </w:r>
-      <w:proofErr w:type="spellEnd"/>
-      <w:r>
-        <w:t xml:space="preserve"> der anderen Wahl standardisieren</w:t>
-      </w:r>
-    </w:p>
-    <w:p>
-      <w:proofErr w:type="spellStart"/>
-      <w:r>
-        <w:t>Nslphom_dual</w:t>
-      </w:r>
-      <w:proofErr w:type="spellEnd"/>
-      <w:r>
-        <w:t xml:space="preserve"> aus mathematischer Sicht und gezeigt, dass es besser performt (schätzt in beide </w:t>
-      </w:r>
-      <w:proofErr w:type="spellStart"/>
-      <w:r>
-        <w:t>richtungen</w:t>
-      </w:r>
-      <w:proofErr w:type="spellEnd"/>
-      <w:r>
-        <w:t>)</w:t>
-      </w:r>
-    </w:p>
-    <w:p>
-      <w:proofErr w:type="spellStart"/>
-      <w:r>
-        <w:t>Iter_max</w:t>
-      </w:r>
-      <w:proofErr w:type="spellEnd"/>
-      <w:r>
-        <w:t xml:space="preserve">: ist 10 wirklich optimal? (siehe neues Material) kann mit höheren </w:t>
-      </w:r>
-      <w:proofErr w:type="spellStart"/>
-      <w:r>
-        <w:t>iter_max</w:t>
-      </w:r>
-      <w:proofErr w:type="spellEnd"/>
-      <w:r>
-        <w:t xml:space="preserve"> überprüfen wie sich (Heterogenität </w:t>
-      </w:r>
-      <w:proofErr w:type="spellStart"/>
-      <w:r>
-        <w:t>EHet</w:t>
-      </w:r>
-      <w:proofErr w:type="spellEnd"/>
-      <w:r>
-        <w:t>??) verhält</w:t>
-      </w:r>
-      <w:r>
-        <w:br/>
-      </w:r>
-      <w:r>
-        <w:br/>
-      </w:r>
-      <w:r>
-        <w:rPr>
-          <w:b/>
-          <w:bCs/>
-        </w:rPr>
-        <w:t>Fall Blockschätzung</w:t>
-      </w:r>
-      <w:r>
-        <w:br/>
-        <w:t xml:space="preserve">+ </w:t>
-      </w:r>
-      <w:proofErr w:type="spellStart"/>
-      <w:r>
-        <w:t>factor</w:t>
-      </w:r>
-      <w:proofErr w:type="spellEnd"/>
-      <w:r>
-        <w:t>(</w:t>
-      </w:r>
-      <w:proofErr w:type="spellStart"/>
-      <w:r>
-        <w:t>nslphom_block</w:t>
-      </w:r>
-      <w:proofErr w:type="spellEnd"/>
-      <w:r>
-        <w:t>): einmal ohne: zeigen sich nur Bundeslandunterschiede, die durch hinzunehmen des Terms verschwinden ist das Regressionsproblem mit Blockschätzung gelöst</w:t>
-      </w:r>
-      <w:r>
-        <w:br/>
-      </w:r>
-      <w:r>
-        <w:br/>
-      </w:r>
-      <w:r>
-        <w:rPr>
-          <w:b/>
-          <w:bCs/>
-        </w:rPr>
-        <w:t xml:space="preserve">Validierung der </w:t>
-      </w:r>
-      <w:proofErr w:type="spellStart"/>
-      <w:r>
-        <w:rPr>
-          <w:b/>
-          <w:bCs/>
-        </w:rPr>
-        <w:t>nslphom</w:t>
-      </w:r>
-      <w:proofErr w:type="spellEnd"/>
-      <w:r>
-        <w:rPr>
-          <w:b/>
-          <w:bCs/>
-        </w:rPr>
-        <w:t xml:space="preserve"> Ergebnisse</w:t>
-      </w:r>
-      <w:r>
-        <w:br/>
-        <w:t>Haben Abweichungen von der Homogenitätsannahme (</w:t>
-      </w:r>
-      <w:proofErr w:type="spellStart"/>
-      <w:r>
-        <w:t>EHet</w:t>
-      </w:r>
-      <w:proofErr w:type="spellEnd"/>
-      <w:r>
-        <w:t xml:space="preserve"> in Modelloutput) eine Struktur?</w:t>
-      </w:r>
-      <w:r>
-        <w:t xml:space="preserve"> </w:t>
-      </w:r>
-      <w:proofErr w:type="spellStart"/>
-      <w:r>
-        <w:t>Z.b.</w:t>
-      </w:r>
-      <w:proofErr w:type="spellEnd"/>
-      <w:r>
-        <w:t xml:space="preserve"> kleinere Wahlaggregationen mit höherer Distanz. Dafür plotten. Quasi Prozentsatz der falsch </w:t>
-      </w:r>
-      <w:proofErr w:type="spellStart"/>
-      <w:r>
-        <w:t>predicteten</w:t>
-      </w:r>
-      <w:proofErr w:type="spellEnd"/>
-      <w:r>
-        <w:t xml:space="preserve"> Bevölkerung: Absolute Zahlen müssen noch mit dem passenden </w:t>
-      </w:r>
-      <w:proofErr w:type="spellStart"/>
-      <w:r>
-        <w:t>agg.schlüssel</w:t>
-      </w:r>
-      <w:proofErr w:type="spellEnd"/>
-      <w:r>
-        <w:t xml:space="preserve"> Wahlberechtigte geteilt werden</w:t>
-      </w:r>
-      <w:r>
-        <w:br/>
-      </w:r>
-      <w:r>
-        <w:br/>
-      </w:r>
-      <w:r>
-        <w:rPr>
-          <w:b/>
-          <w:bCs/>
-        </w:rPr>
-        <w:t>Signifikanz</w:t>
-      </w:r>
-      <w:r>
-        <w:br/>
-        <w:t xml:space="preserve">p-Werte nicht interpretieren und keine Modellselektion darauf. Sie berechnen sich aus den Unsicherheiten der Regression, beziehen jedoch nicht die Unsicherheiten der </w:t>
-      </w:r>
-      <w:proofErr w:type="spellStart"/>
-      <w:r>
-        <w:t>nslphom</w:t>
-      </w:r>
-      <w:proofErr w:type="spellEnd"/>
-      <w:r>
-        <w:t xml:space="preserve"> Schätzung mit ein</w:t>
-      </w:r>
-    </w:p>
-    <w:p>
-      <w:r>
-        <w:t xml:space="preserve">Lösung: Bootstrappen: </w:t>
-      </w:r>
-      <w:proofErr w:type="spellStart"/>
-      <w:r>
-        <w:t>agg.schlüssel</w:t>
-      </w:r>
-      <w:proofErr w:type="spellEnd"/>
-      <w:r>
-        <w:t xml:space="preserve"> samplen nach Bootstrap Prinzip (aus </w:t>
-      </w:r>
-      <w:proofErr w:type="spellStart"/>
-      <w:r>
-        <w:t>computational</w:t>
-      </w:r>
-      <w:proofErr w:type="spellEnd"/>
-      <w:r>
-        <w:t xml:space="preserve"> gründen auf 2000</w:t>
-      </w:r>
-      <w:r>
-        <w:t xml:space="preserve"> (</w:t>
-      </w:r>
-      <w:r>
-        <w:t>1min30</w:t>
-      </w:r>
-      <w:r>
-        <w:t xml:space="preserve">), </w:t>
-      </w:r>
-      <w:r>
-        <w:t xml:space="preserve">4000(4min20), </w:t>
-      </w:r>
-      <w:r>
-        <w:t>5</w:t>
-      </w:r>
-      <w:r>
-        <w:t xml:space="preserve">000 (6min </w:t>
-      </w:r>
-      <w:r>
-        <w:t>1</w:t>
-      </w:r>
-      <w:r>
-        <w:t>0)</w:t>
-      </w:r>
-      <w:r>
-        <w:t xml:space="preserve"> bis maximal </w:t>
-      </w:r>
-      <w:r>
-        <w:t>53</w:t>
-      </w:r>
-      <w:r>
-        <w:t>00</w:t>
-      </w:r>
-      <w:r>
-        <w:t>(&lt;7 min)</w:t>
-      </w:r>
-      <w:r>
-        <w:t xml:space="preserve"> begrenzt) -&gt; </w:t>
-      </w:r>
-      <w:proofErr w:type="spellStart"/>
-      <w:r>
-        <w:t>nslphom</w:t>
-      </w:r>
-      <w:proofErr w:type="spellEnd"/>
-      <w:r>
-        <w:t xml:space="preserve"> -&gt; Regression -&gt; Ergebnis: Verteilung an geschätzten Betas (wenn 0 im KI enthalten, dann nicht signifikant)</w:t>
-      </w:r>
-      <w:r>
-        <w:br/>
-        <w:t>B = 500, 500 Bootstraps</w:t>
-      </w:r>
-      <w:r>
-        <w:br/>
-        <w:t>kein parametrischer Bootstrap</w:t>
-      </w:r>
-      <w:r>
-        <w:br/>
-        <w:t xml:space="preserve">Bootstrapping später über Server </w:t>
-      </w:r>
-      <w:proofErr w:type="spellStart"/>
-      <w:r>
-        <w:t>parallelisierbar</w:t>
-      </w:r>
-      <w:proofErr w:type="spellEnd"/>
-    </w:p>
-    <w:p>
-      <w:r>
-        <w:t>Mit ChatGPT über Alternativen für Quantifizierung der Unsicherheiten sprechen</w:t>
-      </w:r>
-    </w:p>
     <w:p/>
     <w:p>
       <w:pPr>
@@ -863,46 +695,7 @@
           <w:b/>
           <w:bCs/>
         </w:rPr>
-        <w:t>Union zusammenfassen</w:t>
-      </w:r>
-    </w:p>
-    <w:p>
-      <w:pPr>
-        <w:rPr>
-          <w:b/>
-          <w:bCs/>
-        </w:rPr>
-      </w:pPr>
-    </w:p>
-    <w:p>
-      <w:r>
-        <w:rPr>
-          <w:b/>
-          <w:bCs/>
-        </w:rPr>
-        <w:t>Diskussion (wichtigster Teil der Bachelorarbeit)</w:t>
-      </w:r>
-      <w:r>
-        <w:rPr>
-          <w:b/>
-          <w:bCs/>
-        </w:rPr>
-        <w:br/>
-      </w:r>
-      <w:r>
-        <w:t>Problem der sich aggregierenden Fehler</w:t>
-      </w:r>
-      <w:r>
-        <w:br/>
-        <w:t>Warum eigener Ansatz invalide sein könnte</w:t>
-      </w:r>
-      <w:r>
-        <w:br/>
-        <w:t>Nachteile eigener Methode</w:t>
-      </w:r>
-      <w:r>
-        <w:br/>
-        <w:t>Nachteile anderer Methoden, warum diese nicht genommen wurden, obwohl Literatur dagegen spricht</w:t>
+        <w:t>Strukturdaten sammeln</w:t>
       </w:r>
     </w:p>
     <w:sectPr>
@@ -1518,6 +1311,7 @@
   <w:style w:type="character" w:default="1" w:styleId="Absatz-Standardschriftart">
     <w:name w:val="Default Paragraph Font"/>
     <w:uiPriority w:val="1"/>
+    <w:semiHidden/>
     <w:unhideWhenUsed/>
   </w:style>
   <w:style w:type="table" w:default="1" w:styleId="NormaleTabelle">

</xml_diff>

<commit_message>
nslphom_dual effizienter im hauptworkflow symphony lp.solve Vergleich Homogenitätsannahmen pro Partei und pro lokaler Matrix iter_max optimieren Grafik blocked schätzung im hauptworkflow entfernt
</commit_message>
<xml_diff>
--- a/MeinMaterial/Besprechungen/Gespräch5.docx
+++ b/MeinMaterial/Besprechungen/Gespräch5.docx
@@ -642,6 +642,19 @@
         <w:t>dagegen spricht</w:t>
       </w:r>
       <w:proofErr w:type="gramEnd"/>
+    </w:p>
+    <w:p>
+      <w:r>
+        <w:t xml:space="preserve">Annahme homogener politischer </w:t>
+      </w:r>
+      <w:proofErr w:type="spellStart"/>
+      <w:r>
+        <w:t>Treibungsfaktoren</w:t>
+      </w:r>
+      <w:proofErr w:type="spellEnd"/>
+      <w:r>
+        <w:t xml:space="preserve"> in ganz Deutschland</w:t>
+      </w:r>
     </w:p>
     <w:p/>
     <w:p/>

</xml_diff>